<commit_message>
Agrege el primer laboratorio de fundamentos a git
</commit_message>
<xml_diff>
--- a/LaboratorioDeFundamentos-n°1/laboratorio de fundamentos.docx
+++ b/LaboratorioDeFundamentos-n°1/laboratorio de fundamentos.docx
@@ -97,17 +97,16 @@
           <w:sz w:val="42"/>
           <w:szCs w:val="42"/>
         </w:rPr>
-        <w:t xml:space="preserve">Universidad Dr. Andrés Bello </w:t>
-      </w:r>
-      <w:r>
-        <w:rPr>
-          <w:b/>
-          <w:bCs/>
+        <w:t xml:space="preserve">Universidad Dr. Andrés Bello  </w:t>
+      </w:r>
+    </w:p>
+    <w:p>
+      <w:pPr>
+        <w:rPr>
           <w:sz w:val="42"/>
           <w:szCs w:val="42"/>
         </w:rPr>
-        <w:t xml:space="preserve"> </w:t>
-      </w:r>
+      </w:pPr>
     </w:p>
     <w:p>
       <w:pPr>
@@ -116,195 +115,180 @@
           <w:szCs w:val="42"/>
         </w:rPr>
       </w:pPr>
-    </w:p>
-    <w:p>
-      <w:pPr>
-        <w:rPr>
+      <w:r>
+        <w:rPr>
+          <w:b/>
+          <w:bCs/>
           <w:sz w:val="42"/>
           <w:szCs w:val="42"/>
         </w:rPr>
-      </w:pPr>
-      <w:r>
-        <w:rPr>
-          <w:b/>
-          <w:bCs/>
+        <w:t>Estudiante:</w:t>
+      </w:r>
+      <w:r>
+        <w:rPr>
           <w:sz w:val="42"/>
           <w:szCs w:val="42"/>
         </w:rPr>
-        <w:t>Estudiante:</w:t>
-      </w:r>
-      <w:r>
+        <w:t xml:space="preserve"> Diego Fabricio Erazo Deras </w:t>
+      </w:r>
+    </w:p>
+    <w:p>
+      <w:pPr>
         <w:rPr>
           <w:sz w:val="42"/>
           <w:szCs w:val="42"/>
         </w:rPr>
-        <w:t xml:space="preserve"> </w:t>
-      </w:r>
-      <w:r>
+      </w:pPr>
+    </w:p>
+    <w:p>
+      <w:pPr>
         <w:rPr>
           <w:sz w:val="42"/>
           <w:szCs w:val="42"/>
         </w:rPr>
-        <w:t xml:space="preserve">Diego Fabricio Erazo Deras </w:t>
-      </w:r>
-    </w:p>
-    <w:p>
-      <w:pPr>
-        <w:rPr>
+      </w:pPr>
+      <w:r>
+        <w:rPr>
+          <w:b/>
+          <w:bCs/>
           <w:sz w:val="42"/>
           <w:szCs w:val="42"/>
         </w:rPr>
-      </w:pPr>
-    </w:p>
-    <w:p>
-      <w:pPr>
+        <w:t>Asignatura:</w:t>
+      </w:r>
+      <w:r>
         <w:rPr>
           <w:sz w:val="42"/>
           <w:szCs w:val="42"/>
         </w:rPr>
-      </w:pPr>
-      <w:r>
-        <w:rPr>
-          <w:b/>
-          <w:bCs/>
+        <w:t xml:space="preserve"> Fundamentos de Programación </w:t>
+      </w:r>
+    </w:p>
+    <w:p>
+      <w:pPr>
+        <w:rPr>
           <w:sz w:val="42"/>
           <w:szCs w:val="42"/>
         </w:rPr>
-        <w:t>Asignatura:</w:t>
-      </w:r>
-      <w:r>
+      </w:pPr>
+    </w:p>
+    <w:p>
+      <w:pPr>
         <w:rPr>
           <w:sz w:val="42"/>
           <w:szCs w:val="42"/>
         </w:rPr>
-        <w:t xml:space="preserve"> Fundamentos de Programación </w:t>
-      </w:r>
-    </w:p>
-    <w:p>
-      <w:pPr>
-        <w:rPr>
+      </w:pPr>
+      <w:r>
+        <w:rPr>
+          <w:b/>
+          <w:bCs/>
           <w:sz w:val="42"/>
           <w:szCs w:val="42"/>
         </w:rPr>
-      </w:pPr>
-    </w:p>
-    <w:p>
-      <w:pPr>
+        <w:t>Docente:</w:t>
+      </w:r>
+      <w:r>
         <w:rPr>
           <w:sz w:val="42"/>
           <w:szCs w:val="42"/>
         </w:rPr>
-      </w:pPr>
-      <w:r>
-        <w:rPr>
-          <w:b/>
-          <w:bCs/>
+        <w:t xml:space="preserve"> Ever Alfredo Sorto Ayala </w:t>
+      </w:r>
+    </w:p>
+    <w:p>
+      <w:pPr>
+        <w:rPr>
           <w:sz w:val="42"/>
           <w:szCs w:val="42"/>
         </w:rPr>
-        <w:t>Docente:</w:t>
-      </w:r>
-      <w:r>
+      </w:pPr>
+    </w:p>
+    <w:p>
+      <w:pPr>
         <w:rPr>
           <w:sz w:val="42"/>
           <w:szCs w:val="42"/>
         </w:rPr>
-        <w:t xml:space="preserve"> Ever Alfredo Sorto Ayala </w:t>
-      </w:r>
-    </w:p>
-    <w:p>
-      <w:pPr>
-        <w:rPr>
+      </w:pPr>
+      <w:r>
+        <w:rPr>
+          <w:b/>
+          <w:bCs/>
           <w:sz w:val="42"/>
           <w:szCs w:val="42"/>
         </w:rPr>
-      </w:pPr>
-    </w:p>
-    <w:p>
-      <w:pPr>
+        <w:t>Carrera:</w:t>
+      </w:r>
+      <w:r>
         <w:rPr>
           <w:sz w:val="42"/>
           <w:szCs w:val="42"/>
         </w:rPr>
-      </w:pPr>
-      <w:r>
-        <w:rPr>
-          <w:b/>
-          <w:bCs/>
+        <w:t xml:space="preserve"> Ingeniería en Sistemas y Computación </w:t>
+      </w:r>
+    </w:p>
+    <w:p>
+      <w:pPr>
+        <w:rPr>
           <w:sz w:val="42"/>
           <w:szCs w:val="42"/>
         </w:rPr>
-        <w:t>Carrera:</w:t>
-      </w:r>
-      <w:r>
+      </w:pPr>
+    </w:p>
+    <w:p>
+      <w:pPr>
         <w:rPr>
           <w:sz w:val="42"/>
           <w:szCs w:val="42"/>
         </w:rPr>
-        <w:t xml:space="preserve"> Ingeniería en Sistemas y Computación </w:t>
-      </w:r>
-    </w:p>
-    <w:p>
-      <w:pPr>
-        <w:rPr>
+      </w:pPr>
+      <w:r>
+        <w:rPr>
+          <w:b/>
+          <w:bCs/>
           <w:sz w:val="42"/>
           <w:szCs w:val="42"/>
         </w:rPr>
-      </w:pPr>
-    </w:p>
-    <w:p>
-      <w:pPr>
+        <w:t>Ciclo:</w:t>
+      </w:r>
+      <w:r>
         <w:rPr>
           <w:sz w:val="42"/>
           <w:szCs w:val="42"/>
         </w:rPr>
-      </w:pPr>
-      <w:r>
-        <w:rPr>
-          <w:b/>
-          <w:bCs/>
+        <w:t xml:space="preserve"> 1° Ciclo Año: 2026</w:t>
+      </w:r>
+    </w:p>
+    <w:p>
+      <w:pPr>
+        <w:rPr>
           <w:sz w:val="42"/>
           <w:szCs w:val="42"/>
         </w:rPr>
-        <w:t>Ciclo:</w:t>
-      </w:r>
-      <w:r>
+      </w:pPr>
+    </w:p>
+    <w:p>
+      <w:pPr>
         <w:rPr>
           <w:sz w:val="42"/>
           <w:szCs w:val="42"/>
         </w:rPr>
-        <w:t xml:space="preserve"> 1° Ciclo Año: 2026</w:t>
-      </w:r>
-    </w:p>
-    <w:p>
-      <w:pPr>
-        <w:rPr>
+      </w:pPr>
+      <w:r>
+        <w:rPr>
+          <w:b/>
+          <w:bCs/>
           <w:sz w:val="42"/>
           <w:szCs w:val="42"/>
         </w:rPr>
-      </w:pPr>
-    </w:p>
-    <w:p>
-      <w:pPr>
+        <w:t>Fecha entrega:</w:t>
+      </w:r>
+      <w:r>
         <w:rPr>
           <w:sz w:val="42"/>
           <w:szCs w:val="42"/>
         </w:rPr>
-      </w:pPr>
-      <w:r>
-        <w:rPr>
-          <w:b/>
-          <w:bCs/>
-          <w:sz w:val="42"/>
-          <w:szCs w:val="42"/>
-        </w:rPr>
-        <w:t>Fecha entrega:</w:t>
-      </w:r>
-      <w:r>
-        <w:rPr>
-          <w:sz w:val="42"/>
-          <w:szCs w:val="42"/>
-        </w:rPr>
         <w:t xml:space="preserve"> 4 de marzo 2026</w:t>
       </w:r>
     </w:p>
@@ -447,6 +431,7 @@
         <w:rPr>
           <w:b/>
           <w:bCs/>
+          <w:noProof/>
           <w:sz w:val="32"/>
           <w:szCs w:val="32"/>
         </w:rPr>
@@ -525,6 +510,7 @@
       </w:pPr>
       <w:r>
         <w:rPr>
+          <w:noProof/>
           <w:sz w:val="32"/>
           <w:szCs w:val="32"/>
         </w:rPr>
@@ -696,6 +682,7 @@
       </w:pPr>
       <w:r>
         <w:rPr>
+          <w:noProof/>
           <w:sz w:val="32"/>
           <w:szCs w:val="32"/>
         </w:rPr>
@@ -802,6 +789,7 @@
       </w:pPr>
       <w:r>
         <w:rPr>
+          <w:noProof/>
           <w:sz w:val="32"/>
           <w:szCs w:val="32"/>
         </w:rPr>
@@ -911,6 +899,7 @@
       </w:pPr>
       <w:r>
         <w:rPr>
+          <w:noProof/>
           <w:sz w:val="32"/>
           <w:szCs w:val="32"/>
         </w:rPr>
@@ -1091,6 +1080,7 @@
       </w:pPr>
       <w:r>
         <w:rPr>
+          <w:noProof/>
           <w:sz w:val="32"/>
           <w:szCs w:val="32"/>
         </w:rPr>
@@ -1154,6 +1144,43 @@
           <w:lang w:val="es-MX"/>
         </w:rPr>
       </w:pPr>
+      <w:r>
+        <w:rPr>
+          <w:sz w:val="32"/>
+          <w:szCs w:val="32"/>
+          <w:lang w:val="es-MX"/>
+        </w:rPr>
+        <w:t xml:space="preserve">  </w:t>
+      </w:r>
+    </w:p>
+    <w:p>
+      <w:pPr>
+        <w:rPr>
+          <w:sz w:val="32"/>
+          <w:szCs w:val="32"/>
+          <w:lang w:val="es-MX"/>
+        </w:rPr>
+      </w:pPr>
+    </w:p>
+    <w:p>
+      <w:pPr>
+        <w:rPr>
+          <w:sz w:val="32"/>
+          <w:szCs w:val="32"/>
+          <w:lang w:val="es-MX"/>
+        </w:rPr>
+      </w:pPr>
+      <w:hyperlink r:id="rId12" w:history="1">
+        <w:r>
+          <w:rPr>
+            <w:rStyle w:val="Hipervnculo"/>
+            <w:sz w:val="32"/>
+            <w:szCs w:val="32"/>
+            <w:lang w:val="es-MX"/>
+          </w:rPr>
+          <w:t>https://github.com/DIEGO-erazo/semana2refuerzo.git</w:t>
+        </w:r>
+      </w:hyperlink>
     </w:p>
     <w:sectPr>
       <w:pgSz w:w="12240" w:h="15840"/>
@@ -3105,6 +3132,7 @@
   <w:style w:type="character" w:default="1" w:styleId="Fuentedeprrafopredeter">
     <w:name w:val="Default Paragraph Font"/>
     <w:uiPriority w:val="1"/>
+    <w:semiHidden/>
     <w:unhideWhenUsed/>
   </w:style>
   <w:style w:type="table" w:default="1" w:styleId="Tablanormal">
@@ -3418,6 +3446,29 @@
       <w:spacing w:val="5"/>
     </w:rPr>
   </w:style>
+  <w:style w:type="character" w:styleId="Hipervnculo">
+    <w:name w:val="Hyperlink"/>
+    <w:basedOn w:val="Fuentedeprrafopredeter"/>
+    <w:uiPriority w:val="99"/>
+    <w:unhideWhenUsed/>
+    <w:rsid w:val="00D638B5"/>
+    <w:rPr>
+      <w:color w:val="467886" w:themeColor="hyperlink"/>
+      <w:u w:val="single"/>
+    </w:rPr>
+  </w:style>
+  <w:style w:type="character" w:styleId="Mencinsinresolver">
+    <w:name w:val="Unresolved Mention"/>
+    <w:basedOn w:val="Fuentedeprrafopredeter"/>
+    <w:uiPriority w:val="99"/>
+    <w:semiHidden/>
+    <w:unhideWhenUsed/>
+    <w:rsid w:val="00D638B5"/>
+    <w:rPr>
+      <w:color w:val="605E5C"/>
+      <w:shd w:val="clear" w:color="auto" w:fill="E1DFDD"/>
+    </w:rPr>
+  </w:style>
 </w:styles>
 </file>
 

</xml_diff>